<commit_message>
Add randomized vocabulary bank to end of each DOCX
</commit_message>
<xml_diff>
--- a/aviation/fib_200.docx
+++ b/aviation/fib_200.docx
@@ -3200,6 +3200,1546 @@
       </w:pPr>
       <w:r>
         <w:t>A: atomic</w:t>
+      </w:r>
+    </w:p>
+    <w:p/>
+    <w:p>
+      <w:pPr>
+        <w:spacing w:after="120"/>
+      </w:pPr>
+      <w:r>
+        <w:rPr>
+          <w:b/>
+        </w:rPr>
+        <w:t>Vocabulary Bank (Random Mix)</w:t>
+      </w:r>
+    </w:p>
+    <w:p>
+      <w:pPr>
+        <w:spacing w:after="0"/>
+      </w:pPr>
+      <w:r>
+        <w:t>1. 26.88</w:t>
+      </w:r>
+    </w:p>
+    <w:p>
+      <w:pPr>
+        <w:spacing w:after="0"/>
+      </w:pPr>
+      <w:r>
+        <w:t>2. isotropic</w:t>
+      </w:r>
+    </w:p>
+    <w:p>
+      <w:pPr>
+        <w:spacing w:after="0"/>
+      </w:pPr>
+      <w:r>
+        <w:t>3. nodeless</w:t>
+      </w:r>
+    </w:p>
+    <w:p>
+      <w:pPr>
+        <w:spacing w:after="0"/>
+      </w:pPr>
+      <w:r>
+        <w:t>4. Double Sideband (DSB)</w:t>
+      </w:r>
+    </w:p>
+    <w:p>
+      <w:pPr>
+        <w:spacing w:after="0"/>
+      </w:pPr>
+      <w:r>
+        <w:t>5. spread</w:t>
+      </w:r>
+    </w:p>
+    <w:p>
+      <w:pPr>
+        <w:spacing w:after="0"/>
+      </w:pPr>
+      <w:r>
+        <w:t>6. software-defined</w:t>
+      </w:r>
+    </w:p>
+    <w:p>
+      <w:pPr>
+        <w:spacing w:after="0"/>
+      </w:pPr>
+      <w:r>
+        <w:t>7. Hierarchy (SDH)</w:t>
+      </w:r>
+    </w:p>
+    <w:p>
+      <w:pPr>
+        <w:spacing w:after="0"/>
+      </w:pPr>
+      <w:r>
+        <w:t>8. Access (CDMA)</w:t>
+      </w:r>
+    </w:p>
+    <w:p>
+      <w:pPr>
+        <w:spacing w:after="0"/>
+      </w:pPr>
+      <w:r>
+        <w:t>9. As</w:t>
+      </w:r>
+    </w:p>
+    <w:p>
+      <w:pPr>
+        <w:spacing w:after="0"/>
+      </w:pPr>
+      <w:r>
+        <w:t>10. MIDS (Multifunctional Information Distribution System)</w:t>
+      </w:r>
+    </w:p>
+    <w:p>
+      <w:pPr>
+        <w:spacing w:after="0"/>
+      </w:pPr>
+      <w:r>
+        <w:t>11. no (zero)</w:t>
+      </w:r>
+    </w:p>
+    <w:p>
+      <w:pPr>
+        <w:spacing w:after="0"/>
+      </w:pPr>
+      <w:r>
+        <w:t>12. 16,300</w:t>
+      </w:r>
+    </w:p>
+    <w:p>
+      <w:pPr>
+        <w:spacing w:after="0"/>
+      </w:pPr>
+      <w:r>
+        <w:t>13. higher</w:t>
+      </w:r>
+    </w:p>
+    <w:p>
+      <w:pPr>
+        <w:spacing w:after="0"/>
+      </w:pPr>
+      <w:r>
+        <w:t>14. AMS(R)S</w:t>
+      </w:r>
+    </w:p>
+    <w:p>
+      <w:pPr>
+        <w:spacing w:after="0"/>
+      </w:pPr>
+      <w:r>
+        <w:t>15. Unit (CMU)</w:t>
+      </w:r>
+    </w:p>
+    <w:p>
+      <w:pPr>
+        <w:spacing w:after="0"/>
+      </w:pPr>
+      <w:r>
+        <w:t>16. 200</w:t>
+      </w:r>
+    </w:p>
+    <w:p>
+      <w:pPr>
+        <w:spacing w:after="0"/>
+      </w:pPr>
+      <w:r>
+        <w:t>17. 720</w:t>
+      </w:r>
+    </w:p>
+    <w:p>
+      <w:pPr>
+        <w:spacing w:after="0"/>
+      </w:pPr>
+      <w:r>
+        <w:t>18. CLIMAX</w:t>
+      </w:r>
+    </w:p>
+    <w:p>
+      <w:pPr>
+        <w:spacing w:after="0"/>
+      </w:pPr>
+      <w:r>
+        <w:t>19. decade</w:t>
+      </w:r>
+    </w:p>
+    <w:p>
+      <w:pPr>
+        <w:spacing w:after="0"/>
+      </w:pPr>
+      <w:r>
+        <w:t>20. Vocoder</w:t>
+      </w:r>
+    </w:p>
+    <w:p>
+      <w:pPr>
+        <w:spacing w:after="0"/>
+      </w:pPr>
+      <w:r>
+        <w:t>21. 6,370</w:t>
+      </w:r>
+    </w:p>
+    <w:p>
+      <w:pPr>
+        <w:spacing w:after="0"/>
+      </w:pPr>
+      <w:r>
+        <w:t>22. 1,852</w:t>
+      </w:r>
+    </w:p>
+    <w:p>
+      <w:pPr>
+        <w:spacing w:after="0"/>
+      </w:pPr>
+      <w:r>
+        <w:t>23. dependent</w:t>
+      </w:r>
+    </w:p>
+    <w:p>
+      <w:pPr>
+        <w:spacing w:after="0"/>
+      </w:pPr>
+      <w:r>
+        <w:t>24. IPv6 (MIPv6)</w:t>
+      </w:r>
+    </w:p>
+    <w:p>
+      <w:pPr>
+        <w:spacing w:after="0"/>
+      </w:pPr>
+      <w:r>
+        <w:t>25. 400</w:t>
+      </w:r>
+    </w:p>
+    <w:p>
+      <w:pPr>
+        <w:spacing w:after="0"/>
+      </w:pPr>
+      <w:r>
+        <w:t>26. quantization</w:t>
+      </w:r>
+    </w:p>
+    <w:p>
+      <w:pPr>
+        <w:spacing w:after="0"/>
+      </w:pPr>
+      <w:r>
+        <w:t>27. Systems</w:t>
+      </w:r>
+    </w:p>
+    <w:p>
+      <w:pPr>
+        <w:spacing w:after="0"/>
+      </w:pPr>
+      <w:r>
+        <w:t>28. 240</w:t>
+      </w:r>
+    </w:p>
+    <w:p>
+      <w:pPr>
+        <w:spacing w:after="0"/>
+      </w:pPr>
+      <w:r>
+        <w:t>29. 80</w:t>
+      </w:r>
+    </w:p>
+    <w:p>
+      <w:pPr>
+        <w:spacing w:after="0"/>
+      </w:pPr>
+      <w:r>
+        <w:t>30. dBμV/m</w:t>
+      </w:r>
+    </w:p>
+    <w:p>
+      <w:pPr>
+        <w:spacing w:after="0"/>
+      </w:pPr>
+      <w:r>
+        <w:t>31. cognitive</w:t>
+      </w:r>
+    </w:p>
+    <w:p>
+      <w:pPr>
+        <w:spacing w:after="0"/>
+      </w:pPr>
+      <w:r>
+        <w:t>32. Mobility</w:t>
+      </w:r>
+    </w:p>
+    <w:p>
+      <w:pPr>
+        <w:spacing w:after="0"/>
+      </w:pPr>
+      <w:r>
+        <w:t>33. simplex</w:t>
+      </w:r>
+    </w:p>
+    <w:p>
+      <w:pPr>
+        <w:spacing w:after="0"/>
+      </w:pPr>
+      <w:r>
+        <w:t>34. assignment</w:t>
+      </w:r>
+    </w:p>
+    <w:p>
+      <w:pPr>
+        <w:spacing w:after="0"/>
+      </w:pPr>
+      <w:r>
+        <w:t>35. ionospheric</w:t>
+      </w:r>
+    </w:p>
+    <w:p>
+      <w:pPr>
+        <w:spacing w:after="0"/>
+      </w:pPr>
+      <w:r>
+        <w:t>36. CNS</w:t>
+      </w:r>
+    </w:p>
+    <w:p>
+      <w:pPr>
+        <w:spacing w:after="0"/>
+      </w:pPr>
+      <w:r>
+        <w:t>37. N2</w:t>
+      </w:r>
+    </w:p>
+    <w:p>
+      <w:pPr>
+        <w:spacing w:after="0"/>
+      </w:pPr>
+      <w:r>
+        <w:t>38. convergence</w:t>
+      </w:r>
+    </w:p>
+    <w:p>
+      <w:pPr>
+        <w:spacing w:after="0"/>
+      </w:pPr>
+      <w:r>
+        <w:t>39. k</w:t>
+      </w:r>
+    </w:p>
+    <w:p>
+      <w:pPr>
+        <w:spacing w:after="0"/>
+      </w:pPr>
+      <w:r>
+        <w:t>40. backhaul</w:t>
+      </w:r>
+    </w:p>
+    <w:p>
+      <w:pPr>
+        <w:spacing w:after="0"/>
+      </w:pPr>
+      <w:r>
+        <w:t>41. Doppler</w:t>
+      </w:r>
+    </w:p>
+    <w:p>
+      <w:pPr>
+        <w:spacing w:after="0"/>
+      </w:pPr>
+      <w:r>
+        <w:t>42. ITU (International Telecommunication Union)</w:t>
+      </w:r>
+    </w:p>
+    <w:p>
+      <w:pPr>
+        <w:spacing w:after="0"/>
+      </w:pPr>
+      <w:r>
+        <w:t>43. cavity</w:t>
+      </w:r>
+    </w:p>
+    <w:p>
+      <w:pPr>
+        <w:spacing w:after="0"/>
+      </w:pPr>
+      <w:r>
+        <w:t>44. JTIDS (Joint Tactical Information Distribution System)</w:t>
+      </w:r>
+    </w:p>
+    <w:p>
+      <w:pPr>
+        <w:spacing w:after="0"/>
+      </w:pPr>
+      <w:r>
+        <w:t>45. Amplifier (LNA)</w:t>
+      </w:r>
+    </w:p>
+    <w:p>
+      <w:pPr>
+        <w:spacing w:after="0"/>
+      </w:pPr>
+      <w:r>
+        <w:t>46. VSAT (Very Small Aperture Terminal)</w:t>
+      </w:r>
+    </w:p>
+    <w:p>
+      <w:pPr>
+        <w:spacing w:after="0"/>
+      </w:pPr>
+      <w:r>
+        <w:t>47. Viterbi</w:t>
+      </w:r>
+    </w:p>
+    <w:p>
+      <w:pPr>
+        <w:spacing w:after="0"/>
+      </w:pPr>
+      <w:r>
+        <w:t>48. 100</w:t>
+      </w:r>
+    </w:p>
+    <w:p>
+      <w:pPr>
+        <w:spacing w:after="0"/>
+      </w:pPr>
+      <w:r>
+        <w:t>49. interleaving</w:t>
+      </w:r>
+    </w:p>
+    <w:p>
+      <w:pPr>
+        <w:spacing w:after="0"/>
+      </w:pPr>
+      <w:r>
+        <w:t>50. 4</w:t>
+      </w:r>
+    </w:p>
+    <w:p>
+      <w:pPr>
+        <w:spacing w:after="0"/>
+      </w:pPr>
+      <w:r>
+        <w:t>51. Fresnel</w:t>
+      </w:r>
+    </w:p>
+    <w:p>
+      <w:pPr>
+        <w:spacing w:after="0"/>
+      </w:pPr>
+      <w:r>
+        <w:t>52. 137</w:t>
+      </w:r>
+    </w:p>
+    <w:p>
+      <w:pPr>
+        <w:spacing w:after="0"/>
+      </w:pPr>
+      <w:r>
+        <w:t>53. ACARS (Aircraft Communications Addressing and Reporting System)</w:t>
+      </w:r>
+    </w:p>
+    <w:p>
+      <w:pPr>
+        <w:spacing w:after="0"/>
+      </w:pPr>
+      <w:r>
+        <w:t>54. 7.8125</w:t>
+      </w:r>
+    </w:p>
+    <w:p>
+      <w:pPr>
+        <w:spacing w:after="0"/>
+      </w:pPr>
+      <w:r>
+        <w:t>55. Organization</w:t>
+      </w:r>
+    </w:p>
+    <w:p>
+      <w:pPr>
+        <w:spacing w:after="0"/>
+      </w:pPr>
+      <w:r>
+        <w:t>56. Access (TDMA)</w:t>
+      </w:r>
+    </w:p>
+    <w:p>
+      <w:pPr>
+        <w:spacing w:after="0"/>
+      </w:pPr>
+      <w:r>
+        <w:t>57. backward</w:t>
+      </w:r>
+    </w:p>
+    <w:p>
+      <w:pPr>
+        <w:spacing w:after="0"/>
+      </w:pPr>
+      <w:r>
+        <w:t>58. OSI (Open Systems Interconnection)</w:t>
+      </w:r>
+    </w:p>
+    <w:p>
+      <w:pPr>
+        <w:spacing w:after="0"/>
+      </w:pPr>
+      <w:r>
+        <w:t>59. Density (PFD)</w:t>
+      </w:r>
+    </w:p>
+    <w:p>
+      <w:pPr>
+        <w:spacing w:after="0"/>
+      </w:pPr>
+      <w:r>
+        <w:t>60. EPLRS (Enhanced Position Location Reporting System)</w:t>
+      </w:r>
+    </w:p>
+    <w:p>
+      <w:pPr>
+        <w:spacing w:after="0"/>
+      </w:pPr>
+      <w:r>
+        <w:t>61. protection</w:t>
+      </w:r>
+    </w:p>
+    <w:p>
+      <w:pPr>
+        <w:spacing w:after="0"/>
+      </w:pPr>
+      <w:r>
+        <w:t>62. kilohertz</w:t>
+      </w:r>
+    </w:p>
+    <w:p>
+      <w:pPr>
+        <w:spacing w:after="0"/>
+      </w:pPr>
+      <w:r>
+        <w:t>63. CPDLC (Controller-Pilot Data Link Communications)</w:t>
+      </w:r>
+    </w:p>
+    <w:p>
+      <w:pPr>
+        <w:spacing w:after="0"/>
+      </w:pPr>
+      <w:r>
+        <w:t>64. Erlang</w:t>
+      </w:r>
+    </w:p>
+    <w:p>
+      <w:pPr>
+        <w:spacing w:after="0"/>
+      </w:pPr>
+      <w:r>
+        <w:t>65. 10–20</w:t>
+      </w:r>
+    </w:p>
+    <w:p>
+      <w:pPr>
+        <w:spacing w:after="0"/>
+      </w:pPr>
+      <w:r>
+        <w:t>66. resend (retransmission)</w:t>
+      </w:r>
+    </w:p>
+    <w:p>
+      <w:pPr>
+        <w:spacing w:after="0"/>
+      </w:pPr>
+      <w:r>
+        <w:t>67. 2,048</w:t>
+      </w:r>
+    </w:p>
+    <w:p>
+      <w:pPr>
+        <w:spacing w:after="0"/>
+      </w:pPr>
+      <w:r>
+        <w:t>68. earth (GES)</w:t>
+      </w:r>
+    </w:p>
+    <w:p>
+      <w:pPr>
+        <w:spacing w:after="0"/>
+      </w:pPr>
+      <w:r>
+        <w:t>69. Hata-Okumura</w:t>
+      </w:r>
+    </w:p>
+    <w:p>
+      <w:pPr>
+        <w:spacing w:after="0"/>
+      </w:pPr>
+      <w:r>
+        <w:t>70. 31.5</w:t>
+      </w:r>
+    </w:p>
+    <w:p>
+      <w:pPr>
+        <w:spacing w:after="0"/>
+      </w:pPr>
+      <w:r>
+        <w:t>71. Management (ATFM)</w:t>
+      </w:r>
+    </w:p>
+    <w:p>
+      <w:pPr>
+        <w:spacing w:after="0"/>
+      </w:pPr>
+      <w:r>
+        <w:t>72. absorption</w:t>
+      </w:r>
+    </w:p>
+    <w:p>
+      <w:pPr>
+        <w:spacing w:after="0"/>
+      </w:pPr>
+      <w:r>
+        <w:t>73. GFSK (Gaussian Frequency Shift Keying)</w:t>
+      </w:r>
+    </w:p>
+    <w:p>
+      <w:pPr>
+        <w:spacing w:after="0"/>
+      </w:pPr>
+      <w:r>
+        <w:t>74. 15</w:t>
+      </w:r>
+    </w:p>
+    <w:p>
+      <w:pPr>
+        <w:spacing w:after="0"/>
+      </w:pPr>
+      <w:r>
+        <w:t>75. −107</w:t>
+      </w:r>
+    </w:p>
+    <w:p>
+      <w:pPr>
+        <w:spacing w:after="0"/>
+      </w:pPr>
+      <w:r>
+        <w:t>76. 195 (FL195)</w:t>
+      </w:r>
+    </w:p>
+    <w:p>
+      <w:pPr>
+        <w:spacing w:after="0"/>
+      </w:pPr>
+      <w:r>
+        <w:t>77. ACARS</w:t>
+      </w:r>
+    </w:p>
+    <w:p>
+      <w:pPr>
+        <w:spacing w:after="0"/>
+      </w:pPr>
+      <w:r>
+        <w:t>78. LOS (Line-of-Sight)</w:t>
+      </w:r>
+    </w:p>
+    <w:p>
+      <w:pPr>
+        <w:spacing w:after="0"/>
+      </w:pPr>
+      <w:r>
+        <w:t>79. multipath</w:t>
+      </w:r>
+    </w:p>
+    <w:p>
+      <w:pPr>
+        <w:spacing w:after="0"/>
+      </w:pPr>
+      <w:r>
+        <w:t>80. 8DPSK (8-Differential Phase Shift Keying)</w:t>
+      </w:r>
+    </w:p>
+    <w:p>
+      <w:pPr>
+        <w:spacing w:after="0"/>
+      </w:pPr>
+      <w:r>
+        <w:t>81. AM(R)S</w:t>
+      </w:r>
+    </w:p>
+    <w:p>
+      <w:pPr>
+        <w:spacing w:after="0"/>
+      </w:pPr>
+      <w:r>
+        <w:t>82. TCP (Transmission Control Protocol)</w:t>
+      </w:r>
+    </w:p>
+    <w:p>
+      <w:pPr>
+        <w:spacing w:after="0"/>
+      </w:pPr>
+      <w:r>
+        <w:t>83. Network (ATN)</w:t>
+      </w:r>
+    </w:p>
+    <w:p>
+      <w:pPr>
+        <w:spacing w:after="0"/>
+      </w:pPr>
+      <w:r>
+        <w:t>84. R</w:t>
+      </w:r>
+    </w:p>
+    <w:p>
+      <w:pPr>
+        <w:spacing w:after="0"/>
+      </w:pPr>
+      <w:r>
+        <w:t>85. UDP (User Datagram Protocol)</w:t>
+      </w:r>
+    </w:p>
+    <w:p>
+      <w:pPr>
+        <w:spacing w:after="0"/>
+      </w:pPr>
+      <w:r>
+        <w:t>86. priority</w:t>
+      </w:r>
+    </w:p>
+    <w:p>
+      <w:pPr>
+        <w:spacing w:after="0"/>
+      </w:pPr>
+      <w:r>
+        <w:t>87. turbo (or LDPC)</w:t>
+      </w:r>
+    </w:p>
+    <w:p>
+      <w:pPr>
+        <w:spacing w:after="0"/>
+      </w:pPr>
+      <w:r>
+        <w:t>88. modulation</w:t>
+      </w:r>
+    </w:p>
+    <w:p>
+      <w:pPr>
+        <w:spacing w:after="0"/>
+      </w:pPr>
+      <w:r>
+        <w:t>89. Software-Defined (SDR)</w:t>
+      </w:r>
+    </w:p>
+    <w:p>
+      <w:pPr>
+        <w:spacing w:after="0"/>
+      </w:pPr>
+      <w:r>
+        <w:t>90. Volmet</w:t>
+      </w:r>
+    </w:p>
+    <w:p>
+      <w:pPr>
+        <w:spacing w:after="0"/>
+      </w:pPr>
+      <w:r>
+        <w:t>91. clock</w:t>
+      </w:r>
+    </w:p>
+    <w:p>
+      <w:pPr>
+        <w:spacing w:after="0"/>
+      </w:pPr>
+      <w:r>
+        <w:t>92. SWIM (System Wide Information Management)</w:t>
+      </w:r>
+    </w:p>
+    <w:p>
+      <w:pPr>
+        <w:spacing w:after="0"/>
+      </w:pPr>
+      <w:r>
+        <w:t>93. TDMA (Time Division Multiple Access)</w:t>
+      </w:r>
+    </w:p>
+    <w:p>
+      <w:pPr>
+        <w:spacing w:after="0"/>
+      </w:pPr>
+      <w:r>
+        <w:t>94. jitter</w:t>
+      </w:r>
+    </w:p>
+    <w:p>
+      <w:pPr>
+        <w:spacing w:after="0"/>
+      </w:pPr>
+      <w:r>
+        <w:t>95. Orthogonal (OFDM)</w:t>
+      </w:r>
+    </w:p>
+    <w:p>
+      <w:pPr>
+        <w:spacing w:after="0"/>
+      </w:pPr>
+      <w:r>
+        <w:t>96. 1</w:t>
+      </w:r>
+    </w:p>
+    <w:p>
+      <w:pPr>
+        <w:spacing w:after="0"/>
+      </w:pPr>
+      <w:r>
+        <w:t>97. 70</w:t>
+      </w:r>
+    </w:p>
+    <w:p>
+      <w:pPr>
+        <w:spacing w:after="0"/>
+      </w:pPr>
+      <w:r>
+        <w:t>98. SSB-AM (Single Sideband Amplitude Modulation)</w:t>
+      </w:r>
+    </w:p>
+    <w:p>
+      <w:pPr>
+        <w:spacing w:after="0"/>
+      </w:pPr>
+      <w:r>
+        <w:t>99. Quadrature (QAM)</w:t>
+      </w:r>
+    </w:p>
+    <w:p>
+      <w:pPr>
+        <w:spacing w:after="0"/>
+      </w:pPr>
+      <w:r>
+        <w:t>100. Modulation (PCM)</w:t>
+      </w:r>
+    </w:p>
+    <w:p>
+      <w:pPr>
+        <w:spacing w:after="0"/>
+      </w:pPr>
+      <w:r>
+        <w:t>101. GSM</w:t>
+      </w:r>
+    </w:p>
+    <w:p>
+      <w:pPr>
+        <w:spacing w:after="0"/>
+      </w:pPr>
+      <w:r>
+        <w:t>102. superheterodyne</w:t>
+      </w:r>
+    </w:p>
+    <w:p>
+      <w:pPr>
+        <w:spacing w:after="0"/>
+      </w:pPr>
+      <w:r>
+        <w:t>103. FSK (Frequency Shift Keying)</w:t>
+      </w:r>
+    </w:p>
+    <w:p>
+      <w:pPr>
+        <w:spacing w:after="0"/>
+      </w:pPr>
+      <w:r>
+        <w:t>104. transmitter (Tx)</w:t>
+      </w:r>
+    </w:p>
+    <w:p>
+      <w:pPr>
+        <w:spacing w:after="0"/>
+      </w:pPr>
+      <w:r>
+        <w:t>105. 6</w:t>
+      </w:r>
+    </w:p>
+    <w:p>
+      <w:pPr>
+        <w:spacing w:after="0"/>
+      </w:pPr>
+      <w:r>
+        <w:t>106. ducting</w:t>
+      </w:r>
+    </w:p>
+    <w:p>
+      <w:pPr>
+        <w:spacing w:after="0"/>
+      </w:pPr>
+      <w:r>
+        <w:t>107. sky</w:t>
+      </w:r>
+    </w:p>
+    <w:p>
+      <w:pPr>
+        <w:spacing w:after="0"/>
+      </w:pPr>
+      <w:r>
+        <w:t>108. Cs</w:t>
+      </w:r>
+    </w:p>
+    <w:p>
+      <w:pPr>
+        <w:spacing w:after="0"/>
+      </w:pPr>
+      <w:r>
+        <w:t>109. Orthogonal</w:t>
+      </w:r>
+    </w:p>
+    <w:p>
+      <w:pPr>
+        <w:spacing w:after="0"/>
+      </w:pPr>
+      <w:r>
+        <w:t>110. ±5</w:t>
+      </w:r>
+    </w:p>
+    <w:p>
+      <w:pPr>
+        <w:spacing w:after="0"/>
+      </w:pPr>
+      <w:r>
+        <w:t>111. Internet</w:t>
+      </w:r>
+    </w:p>
+    <w:p>
+      <w:pPr>
+        <w:spacing w:after="0"/>
+      </w:pPr>
+      <w:r>
+        <w:t>112. 13</w:t>
+      </w:r>
+    </w:p>
+    <w:p>
+      <w:pPr>
+        <w:spacing w:after="0"/>
+      </w:pPr>
+      <w:r>
+        <w:t>113. Union (ITU)</w:t>
+      </w:r>
+    </w:p>
+    <w:p>
+      <w:pPr>
+        <w:spacing w:after="0"/>
+      </w:pPr>
+      <w:r>
+        <w:t>114. atomic</w:t>
+      </w:r>
+    </w:p>
+    <w:p>
+      <w:pPr>
+        <w:spacing w:after="0"/>
+      </w:pPr>
+      <w:r>
+        <w:t>115. Single Sideband AM (SSB-AM)</w:t>
+      </w:r>
+    </w:p>
+    <w:p>
+      <w:pPr>
+        <w:spacing w:after="0"/>
+      </w:pPr>
+      <w:r>
+        <w:t>116. allocation</w:t>
+      </w:r>
+    </w:p>
+    <w:p>
+      <w:pPr>
+        <w:spacing w:after="0"/>
+      </w:pPr>
+      <w:r>
+        <w:t>117. voting</w:t>
+      </w:r>
+    </w:p>
+    <w:p>
+      <w:pPr>
+        <w:spacing w:after="0"/>
+      </w:pPr>
+      <w:r>
+        <w:t>118. 3 × 10⁸</w:t>
+      </w:r>
+    </w:p>
+    <w:p>
+      <w:pPr>
+        <w:spacing w:after="0"/>
+      </w:pPr>
+      <w:r>
+        <w:t>119. −93.9</w:t>
+      </w:r>
+    </w:p>
+    <w:p>
+      <w:pPr>
+        <w:spacing w:after="0"/>
+      </w:pPr>
+      <w:r>
+        <w:t>120. 35,790</w:t>
+      </w:r>
+    </w:p>
+    <w:p>
+      <w:pPr>
+        <w:spacing w:after="0"/>
+      </w:pPr>
+      <w:r>
+        <w:t>121. RTCA (Radio Technical Commission for Aeronautics)</w:t>
+      </w:r>
+    </w:p>
+    <w:p>
+      <w:pPr>
+        <w:spacing w:after="0"/>
+      </w:pPr>
+      <w:r>
+        <w:t>122. Ka</w:t>
+      </w:r>
+    </w:p>
+    <w:p>
+      <w:pPr>
+        <w:spacing w:after="0"/>
+      </w:pPr>
+      <w:r>
+        <w:t>123. water</w:t>
+      </w:r>
+    </w:p>
+    <w:p>
+      <w:pPr>
+        <w:spacing w:after="0"/>
+      </w:pPr>
+      <w:r>
+        <w:t>124. SINCGARS (Single Channel Ground and Airborne Radio System)</w:t>
+      </w:r>
+    </w:p>
+    <w:p>
+      <w:pPr>
+        <w:spacing w:after="0"/>
+      </w:pPr>
+      <w:r>
+        <w:t>125. Control</w:t>
+      </w:r>
+    </w:p>
+    <w:p>
+      <w:pPr>
+        <w:spacing w:after="0"/>
+      </w:pPr>
+      <w:r>
+        <w:t>126. vertically</w:t>
+      </w:r>
+    </w:p>
+    <w:p>
+      <w:pPr>
+        <w:spacing w:after="0"/>
+      </w:pPr>
+      <w:r>
+        <w:t>127. exceeds</w:t>
+      </w:r>
+    </w:p>
+    <w:p>
+      <w:pPr>
+        <w:spacing w:after="0"/>
+      </w:pPr>
+      <w:r>
+        <w:t>128. clear</w:t>
+      </w:r>
+    </w:p>
+    <w:p>
+      <w:pPr>
+        <w:spacing w:after="0"/>
+      </w:pPr>
+      <w:r>
+        <w:t>129. Checking (CRC)</w:t>
+      </w:r>
+    </w:p>
+    <w:p>
+      <w:pPr>
+        <w:spacing w:after="0"/>
+      </w:pPr>
+      <w:r>
+        <w:t>130. Conferences (WRCs)</w:t>
+      </w:r>
+    </w:p>
+    <w:p>
+      <w:pPr>
+        <w:spacing w:after="0"/>
+      </w:pPr>
+      <w:r>
+        <w:t>131. squelch</w:t>
+      </w:r>
+    </w:p>
+    <w:p>
+      <w:pPr>
+        <w:spacing w:after="0"/>
+      </w:pPr>
+      <w:r>
+        <w:t>132. 2/3</w:t>
+      </w:r>
+    </w:p>
+    <w:p>
+      <w:pPr>
+        <w:spacing w:after="0"/>
+      </w:pPr>
+      <w:r>
+        <w:t>133. Correction (FEC)</w:t>
+      </w:r>
+    </w:p>
+    <w:p>
+      <w:pPr>
+        <w:spacing w:after="0"/>
+      </w:pPr>
+      <w:r>
+        <w:t>134. wavelengths</w:t>
+      </w:r>
+    </w:p>
+    <w:p>
+      <w:pPr>
+        <w:spacing w:after="0"/>
+      </w:pPr>
+      <w:r>
+        <w:t>135. refractive</w:t>
+      </w:r>
+    </w:p>
+    <w:p>
+      <w:pPr>
+        <w:spacing w:after="0"/>
+      </w:pPr>
+      <w:r>
+        <w:t>136. frequency</w:t>
+      </w:r>
+    </w:p>
+    <w:p>
+      <w:pPr>
+        <w:spacing w:after="0"/>
+      </w:pPr>
+      <w:r>
+        <w:t>137. 150–200</w:t>
+      </w:r>
+    </w:p>
+    <w:p>
+      <w:pPr>
+        <w:spacing w:after="0"/>
+      </w:pPr>
+      <w:r>
+        <w:t>138. maximal</w:t>
+      </w:r>
+    </w:p>
+    <w:p>
+      <w:pPr>
+        <w:spacing w:after="0"/>
+      </w:pPr>
+      <w:r>
+        <w:t>139. 180</w:t>
+      </w:r>
+    </w:p>
+    <w:p>
+      <w:pPr>
+        <w:spacing w:after="0"/>
+      </w:pPr>
+      <w:r>
+        <w:t>140. binding</w:t>
+      </w:r>
+    </w:p>
+    <w:p>
+      <w:pPr>
+        <w:spacing w:after="0"/>
+      </w:pPr>
+      <w:r>
+        <w:t>141. Reference</w:t>
+      </w:r>
+    </w:p>
+    <w:p>
+      <w:pPr>
+        <w:spacing w:after="0"/>
+      </w:pPr>
+      <w:r>
+        <w:t>142. 2,280</w:t>
+      </w:r>
+    </w:p>
+    <w:p>
+      <w:pPr>
+        <w:spacing w:after="0"/>
+      </w:pPr>
+      <w:r>
+        <w:t>143. Shannon</w:t>
+      </w:r>
+    </w:p>
+    <w:p>
+      <w:pPr>
+        <w:spacing w:after="0"/>
+      </w:pPr>
+      <w:r>
+        <w:t>144. circular</w:t>
+      </w:r>
+    </w:p>
+    <w:p>
+      <w:pPr>
+        <w:spacing w:after="0"/>
+      </w:pPr>
+      <w:r>
+        <w:t>145. MPLS (Multi-Protocol Label Switching)</w:t>
+      </w:r>
+    </w:p>
+    <w:p>
+      <w:pPr>
+        <w:spacing w:after="0"/>
+      </w:pPr>
+      <w:r>
+        <w:t>146. 10</w:t>
+      </w:r>
+    </w:p>
+    <w:p>
+      <w:pPr>
+        <w:spacing w:after="0"/>
+      </w:pPr>
+      <w:r>
+        <w:t>147. Count</w:t>
+      </w:r>
+    </w:p>
+    <w:p>
+      <w:pPr>
+        <w:spacing w:after="0"/>
+      </w:pPr>
+      <w:r>
+        <w:t>148. HAVEQUICK</w:t>
+      </w:r>
+    </w:p>
+    <w:p>
+      <w:pPr>
+        <w:spacing w:after="0"/>
+      </w:pPr>
+      <w:r>
+        <w:t>149. latitude (arc)</w:t>
+      </w:r>
+    </w:p>
+    <w:p>
+      <w:pPr>
+        <w:spacing w:after="0"/>
+      </w:pPr>
+      <w:r>
+        <w:t>150. intermodulation</w:t>
+      </w:r>
+    </w:p>
+    <w:p>
+      <w:pPr>
+        <w:spacing w:after="0"/>
+      </w:pPr>
+      <w:r>
+        <w:t>151. Access</w:t>
+      </w:r>
+    </w:p>
+    <w:p>
+      <w:pPr>
+        <w:spacing w:after="0"/>
+      </w:pPr>
+      <w:r>
+        <w:t>152. rain</w:t>
+      </w:r>
+    </w:p>
+    <w:p>
+      <w:pPr>
+        <w:spacing w:after="0"/>
+      </w:pPr>
+      <w:r>
+        <w:t>153. L</w:t>
+      </w:r>
+    </w:p>
+    <w:p>
+      <w:pPr>
+        <w:spacing w:after="0"/>
+      </w:pPr>
+      <w:r>
+        <w:t>154. sampling</w:t>
+      </w:r>
+    </w:p>
+    <w:p>
+      <w:pPr>
+        <w:spacing w:after="0"/>
+      </w:pPr>
+      <w:r>
+        <w:t>155. GPS</w:t>
+      </w:r>
+    </w:p>
+    <w:p>
+      <w:pPr>
+        <w:spacing w:after="0"/>
+      </w:pPr>
+      <w:r>
+        <w:t>156. oscillator</w:t>
+      </w:r>
+    </w:p>
+    <w:p>
+      <w:pPr>
+        <w:spacing w:after="0"/>
+      </w:pPr>
+      <w:r>
+        <w:t>157. 50 (or 75)</w:t>
+      </w:r>
+    </w:p>
+    <w:p>
+      <w:pPr>
+        <w:spacing w:after="0"/>
+      </w:pPr>
+      <w:r>
+        <w:t>158. Access (FDMA)</w:t>
+      </w:r>
+    </w:p>
+    <w:p>
+      <w:pPr>
+        <w:spacing w:after="0"/>
+      </w:pPr>
+      <w:r>
+        <w:t>159. Eurocontrol</w:t>
+      </w:r>
+    </w:p>
+    <w:p>
+      <w:pPr>
+        <w:spacing w:after="0"/>
+      </w:pPr>
+      <w:r>
+        <w:t>160. Performance</w:t>
+      </w:r>
+    </w:p>
+    <w:p>
+      <w:pPr>
+        <w:spacing w:after="0"/>
+      </w:pPr>
+      <w:r>
+        <w:t>161. PKI</w:t>
+      </w:r>
+    </w:p>
+    <w:p>
+      <w:pPr>
+        <w:spacing w:after="0"/>
+      </w:pPr>
+      <w:r>
+        <w:t>162. ADS-B (Automatic Dependent Surveillance-Broadcast)</w:t>
+      </w:r>
+    </w:p>
+    <w:p>
+      <w:pPr>
+        <w:spacing w:after="0"/>
+      </w:pPr>
+      <w:r>
+        <w:t>163. 60</w:t>
+      </w:r>
+    </w:p>
+    <w:p>
+      <w:pPr>
+        <w:spacing w:after="0"/>
+      </w:pPr>
+      <w:r>
+        <w:t>164. companding</w:t>
+      </w:r>
+    </w:p>
+    <w:p>
+      <w:pPr>
+        <w:spacing w:after="0"/>
+      </w:pPr>
+      <w:r>
+        <w:t>165. worst-case</w:t>
+      </w:r>
+    </w:p>
+    <w:p>
+      <w:pPr>
+        <w:spacing w:after="0"/>
+      </w:pPr>
+      <w:r>
+        <w:t>166. great-circle</w:t>
+      </w:r>
+    </w:p>
+    <w:p>
+      <w:pPr>
+        <w:spacing w:after="0"/>
+      </w:pPr>
+      <w:r>
+        <w:t>167. bit (BER)</w:t>
+      </w:r>
+    </w:p>
+    <w:p>
+      <w:pPr>
+        <w:spacing w:after="0"/>
+      </w:pPr>
+      <w:r>
+        <w:t>168. Trellis (TCM)</w:t>
+      </w:r>
+    </w:p>
+    <w:p>
+      <w:pPr>
+        <w:spacing w:after="0"/>
+      </w:pPr>
+      <w:r>
+        <w:t>169. polar</w:t>
+      </w:r>
+    </w:p>
+    <w:p>
+      <w:pPr>
+        <w:spacing w:after="0"/>
+      </w:pPr>
+      <w:r>
+        <w:t>170. SELCAL</w:t>
+      </w:r>
+    </w:p>
+    <w:p>
+      <w:pPr>
+        <w:spacing w:after="0"/>
+      </w:pPr>
+      <w:r>
+        <w:t>171. Reed-Solomon</w:t>
+      </w:r>
+    </w:p>
+    <w:p>
+      <w:pPr>
+        <w:spacing w:after="0"/>
+      </w:pPr>
+      <w:r>
+        <w:t>172. antenna (aerial)</w:t>
+      </w:r>
+    </w:p>
+    <w:p>
+      <w:pPr>
+        <w:spacing w:after="0"/>
+      </w:pPr>
+      <w:r>
+        <w:t>173. Management (UTM)</w:t>
+      </w:r>
+    </w:p>
+    <w:p>
+      <w:pPr>
+        <w:spacing w:after="0"/>
+      </w:pPr>
+      <w:r>
+        <w:t>174. free space (FSPL)</w:t>
+      </w:r>
+    </w:p>
+    <w:p>
+      <w:pPr>
+        <w:spacing w:after="0"/>
+      </w:pPr>
+      <w:r>
+        <w:t>175. 377</w:t>
+      </w:r>
+    </w:p>
+    <w:p>
+      <w:pPr>
+        <w:spacing w:after="0"/>
+      </w:pPr>
+      <w:r>
+        <w:t>176. 107.52</w:t>
+      </w:r>
+    </w:p>
+    <w:p>
+      <w:pPr>
+        <w:spacing w:after="0"/>
+      </w:pPr>
+      <w:r>
+        <w:t>177. 20</w:t>
+      </w:r>
+    </w:p>
+    <w:p>
+      <w:pPr>
+        <w:spacing w:after="0"/>
+      </w:pPr>
+      <w:r>
+        <w:t>178. within</w:t>
+      </w:r>
+    </w:p>
+    <w:p>
+      <w:pPr>
+        <w:spacing w:after="0"/>
+      </w:pPr>
+      <w:r>
+        <w:t>179. 1.5</w:t>
+      </w:r>
+    </w:p>
+    <w:p>
+      <w:pPr>
+        <w:spacing w:after="0"/>
+      </w:pPr>
+      <w:r>
+        <w:t>180. milliwatts</w:t>
+      </w:r>
+    </w:p>
+    <w:p>
+      <w:pPr>
+        <w:spacing w:after="0"/>
+      </w:pPr>
+      <w:r>
+        <w:t>181. TCAS (Traffic Collision Avoidance System)</w:t>
+      </w:r>
+    </w:p>
+    <w:p>
+      <w:pPr>
+        <w:spacing w:after="0"/>
+      </w:pPr>
+      <w:r>
+        <w:t>182. CSMA (Carrier Sense Multiple Access)</w:t>
+      </w:r>
+    </w:p>
+    <w:p>
+      <w:pPr>
+        <w:spacing w:after="0"/>
+      </w:pPr>
+      <w:r>
+        <w:t>183. repeating</w:t>
+      </w:r>
+    </w:p>
+    <w:p>
+      <w:pPr>
+        <w:spacing w:after="0"/>
+      </w:pPr>
+      <w:r>
+        <w:t>184. sunspot (solar)</w:t>
+      </w:r>
+    </w:p>
+    <w:p>
+      <w:pPr>
+        <w:spacing w:after="0"/>
+      </w:pPr>
+      <w:r>
+        <w:t>185. 14</w:t>
+      </w:r>
+    </w:p>
+    <w:p>
+      <w:pPr>
+        <w:spacing w:after="0"/>
+      </w:pPr>
+      <w:r>
+        <w:t>186. Self-Organizing (STDMA)</w:t>
+      </w:r>
+    </w:p>
+    <w:p>
+      <w:pPr>
+        <w:spacing w:after="0"/>
+      </w:pPr>
+      <w:r>
+        <w:t>187. multilateral</w:t>
+      </w:r>
+    </w:p>
+    <w:p>
+      <w:pPr>
+        <w:spacing w:after="0"/>
+      </w:pPr>
+      <w:r>
+        <w:t>188. Ethernet</w:t>
+      </w:r>
+    </w:p>
+    <w:p>
+      <w:pPr>
+        <w:spacing w:after="0"/>
+      </w:pPr>
+      <w:r>
+        <w:t>189. 121.5</w:t>
+      </w:r>
+    </w:p>
+    <w:p>
+      <w:pPr>
+        <w:spacing w:after="0"/>
+      </w:pPr>
+      <w:r>
+        <w:t>190. ABPSK</w:t>
+      </w:r>
+    </w:p>
+    <w:p>
+      <w:pPr>
+        <w:spacing w:after="0"/>
+      </w:pPr>
+      <w:r>
+        <w:t>191. 12</w:t>
       </w:r>
     </w:p>
     <w:sectPr>

</xml_diff>